<commit_message>
KUT delivery playbook: worksharing, model hosting and links (6.1)
The issued, client-facing playbook gains the tool-neutral rules every
appointed party works to: hosting options and their conditions, no
cross-firm linking of centrals, network paths not drive letters, no
file-sync clients, daily local copies, sync and relinquish cadence,
model owner audit/compact, datum ownership, and link settings.
Regenerated with tools/build_team_playbook.py; check_kut_documents.py
passes (no tooling named).

Co-Authored-By: Claude Opus 5.5 <noreply@anthropic.com>
</commit_message>
<xml_diff>
--- a/KUT_DOCS_WORKING/issued/KUT_Project_Delivery_Playbook.docx
+++ b/KUT_DOCS_WORKING/issued/KUT_Project_Delivery_Playbook.docx
@@ -17572,6 +17572,526 @@
       <w:pPr>
         <w:spacing w:after="40"/>
       </w:pPr>
+    </w:p>
+    <w:p>
+      <w:pPr>
+        <w:pStyle w:val="Heading2"/>
+      </w:pPr>
+      <w:r>
+        <w:t>6.1  Worksharing, model hosting and links</w:t>
+      </w:r>
+    </w:p>
+    <w:p>
+      <w:r>
+        <w:rPr>
+          <w:b w:val="0"/>
+          <w:i w:val="0"/>
+        </w:rPr>
+        <w:t>Each discipline of each volume is a separate model, named as a container under Section 4. A model edited by more than one person at a time is workshared: one central model and a local copy for each person. Where central models are hosted is confirmed at mobilisation and recorded in the BIM Execution Plan.</w:t>
+      </w:r>
+    </w:p>
+    <w:tbl>
+      <w:tblPr>
+        <w:tblStyle w:val="TableGrid"/>
+        <w:tblW w:type="auto" w:w="0"/>
+        <w:jc w:val="left"/>
+        <w:tblLook w:firstColumn="1" w:firstRow="1" w:lastColumn="0" w:lastRow="0" w:noHBand="0" w:noVBand="1" w:val="04A0"/>
+      </w:tblPr>
+      <w:tblGrid>
+        <w:gridCol w:w="3137"/>
+        <w:gridCol w:w="3137"/>
+        <w:gridCol w:w="3137"/>
+      </w:tblGrid>
+      <w:tr>
+        <w:trPr>
+          <w:tblHeader/>
+        </w:trPr>
+        <w:tc>
+          <w:tcPr>
+            <w:tcW w:type="dxa" w:w="2835"/>
+            <w:shd w:val="clear" w:fill="E8EDF3"/>
+          </w:tcPr>
+          <w:p>
+            <w:r/>
+            <w:r>
+              <w:rPr>
+                <w:b/>
+                <w:color w:val="1F3654"/>
+                <w:sz w:val="17"/>
+              </w:rPr>
+              <w:t>Hosting option</w:t>
+            </w:r>
+          </w:p>
+        </w:tc>
+        <w:tc>
+          <w:tcPr>
+            <w:tcW w:type="dxa" w:w="3515"/>
+            <w:shd w:val="clear" w:fill="E8EDF3"/>
+          </w:tcPr>
+          <w:p>
+            <w:r/>
+            <w:r>
+              <w:rPr>
+                <w:b/>
+                <w:color w:val="1F3654"/>
+                <w:sz w:val="17"/>
+              </w:rPr>
+              <w:t>When it is used</w:t>
+            </w:r>
+          </w:p>
+        </w:tc>
+        <w:tc>
+          <w:tcPr>
+            <w:tcW w:type="dxa" w:w="3061"/>
+            <w:shd w:val="clear" w:fill="E8EDF3"/>
+          </w:tcPr>
+          <w:p>
+            <w:r/>
+            <w:r>
+              <w:rPr>
+                <w:b/>
+                <w:color w:val="1F3654"/>
+                <w:sz w:val="17"/>
+              </w:rPr>
+              <w:t>Condition</w:t>
+            </w:r>
+          </w:p>
+        </w:tc>
+      </w:tr>
+      <w:tr>
+        <w:tc>
+          <w:tcPr>
+            <w:tcW w:type="dxa" w:w="2835"/>
+          </w:tcPr>
+          <w:p>
+            <w:pPr>
+              <w:spacing w:after="40"/>
+            </w:pPr>
+            <w:r>
+              <w:rPr>
+                <w:sz w:val="17"/>
+              </w:rPr>
+            </w:r>
+            <w:r>
+              <w:rPr>
+                <w:b w:val="0"/>
+                <w:sz w:val="17"/>
+              </w:rPr>
+              <w:t>Office file server of the originating organisation</w:t>
+            </w:r>
+          </w:p>
+        </w:tc>
+        <w:tc>
+          <w:tcPr>
+            <w:tcW w:type="dxa" w:w="3515"/>
+          </w:tcPr>
+          <w:p>
+            <w:pPr>
+              <w:spacing w:after="40"/>
+            </w:pPr>
+            <w:r>
+              <w:rPr>
+                <w:sz w:val="17"/>
+              </w:rPr>
+            </w:r>
+            <w:r>
+              <w:rPr>
+                <w:b w:val="0"/>
+                <w:sz w:val="17"/>
+              </w:rPr>
+              <w:t>The default. Each organisation hosts its own central models on its own network</w:t>
+            </w:r>
+          </w:p>
+        </w:tc>
+        <w:tc>
+          <w:tcPr>
+            <w:tcW w:type="dxa" w:w="3061"/>
+          </w:tcPr>
+          <w:p>
+            <w:pPr>
+              <w:spacing w:after="40"/>
+            </w:pPr>
+            <w:r>
+              <w:rPr>
+                <w:sz w:val="17"/>
+              </w:rPr>
+            </w:r>
+            <w:r>
+              <w:rPr>
+                <w:b w:val="0"/>
+                <w:sz w:val="17"/>
+              </w:rPr>
+              <w:t>None beyond the requirements below</w:t>
+            </w:r>
+          </w:p>
+        </w:tc>
+      </w:tr>
+      <w:tr>
+        <w:tc>
+          <w:tcPr>
+            <w:tcW w:type="dxa" w:w="2835"/>
+          </w:tcPr>
+          <w:p>
+            <w:pPr>
+              <w:spacing w:after="40"/>
+            </w:pPr>
+            <w:r>
+              <w:rPr>
+                <w:sz w:val="17"/>
+              </w:rPr>
+            </w:r>
+            <w:r>
+              <w:rPr>
+                <w:b w:val="0"/>
+                <w:sz w:val="17"/>
+              </w:rPr>
+              <w:t>Revit Server</w:t>
+            </w:r>
+          </w:p>
+        </w:tc>
+        <w:tc>
+          <w:tcPr>
+            <w:tcW w:type="dxa" w:w="3515"/>
+          </w:tcPr>
+          <w:p>
+            <w:pPr>
+              <w:spacing w:after="40"/>
+            </w:pPr>
+            <w:r>
+              <w:rPr>
+                <w:sz w:val="17"/>
+              </w:rPr>
+            </w:r>
+            <w:r>
+              <w:rPr>
+                <w:b w:val="0"/>
+                <w:sz w:val="17"/>
+              </w:rPr>
+              <w:t>Only where one organisation edits the same model from more than one office</w:t>
+            </w:r>
+          </w:p>
+        </w:tc>
+        <w:tc>
+          <w:tcPr>
+            <w:tcW w:type="dxa" w:w="3061"/>
+          </w:tcPr>
+          <w:p>
+            <w:pPr>
+              <w:spacing w:after="40"/>
+            </w:pPr>
+            <w:r>
+              <w:rPr>
+                <w:sz w:val="17"/>
+              </w:rPr>
+            </w:r>
+            <w:r>
+              <w:rPr>
+                <w:b w:val="0"/>
+                <w:sz w:val="17"/>
+              </w:rPr>
+              <w:t>Agreed with the Information Manager</w:t>
+            </w:r>
+          </w:p>
+        </w:tc>
+      </w:tr>
+      <w:tr>
+        <w:tc>
+          <w:tcPr>
+            <w:tcW w:type="dxa" w:w="2835"/>
+          </w:tcPr>
+          <w:p>
+            <w:pPr>
+              <w:spacing w:after="40"/>
+            </w:pPr>
+            <w:r>
+              <w:rPr>
+                <w:sz w:val="17"/>
+              </w:rPr>
+            </w:r>
+            <w:r>
+              <w:rPr>
+                <w:b w:val="0"/>
+                <w:sz w:val="17"/>
+              </w:rPr>
+              <w:t>Cloud worksharing in the Common Data Environment</w:t>
+            </w:r>
+          </w:p>
+        </w:tc>
+        <w:tc>
+          <w:tcPr>
+            <w:tcW w:type="dxa" w:w="3515"/>
+          </w:tcPr>
+          <w:p>
+            <w:pPr>
+              <w:spacing w:after="40"/>
+            </w:pPr>
+            <w:r>
+              <w:rPr>
+                <w:sz w:val="17"/>
+              </w:rPr>
+            </w:r>
+            <w:r>
+              <w:rPr>
+                <w:b w:val="0"/>
+                <w:sz w:val="17"/>
+              </w:rPr>
+              <w:t>Only after a pilot on one model agreed with the Information Manager</w:t>
+            </w:r>
+          </w:p>
+        </w:tc>
+        <w:tc>
+          <w:tcPr>
+            <w:tcW w:type="dxa" w:w="3061"/>
+          </w:tcPr>
+          <w:p>
+            <w:pPr>
+              <w:spacing w:after="40"/>
+            </w:pPr>
+            <w:r>
+              <w:rPr>
+                <w:sz w:val="17"/>
+              </w:rPr>
+            </w:r>
+            <w:r>
+              <w:rPr>
+                <w:b w:val="0"/>
+                <w:sz w:val="17"/>
+              </w:rPr>
+              <w:t>Every author editing the model holds a licence that permits cloud worksharing, and the office connection has been tested</w:t>
+            </w:r>
+          </w:p>
+        </w:tc>
+      </w:tr>
+    </w:tbl>
+    <w:p>
+      <w:pPr>
+        <w:spacing w:after="40"/>
+      </w:pPr>
+    </w:p>
+    <w:p>
+      <w:r>
+        <w:rPr>
+          <w:b w:val="0"/>
+          <w:i w:val="0"/>
+        </w:rPr>
+        <w:t>The following apply whichever option is used.</w:t>
+      </w:r>
+    </w:p>
+    <w:p>
+      <w:pPr>
+        <w:spacing w:after="60"/>
+        <w:ind w:left="340"/>
+      </w:pPr>
+      <w:r>
+        <w:rPr>
+          <w:b/>
+        </w:rPr>
+        <w:t xml:space="preserve">• </w:t>
+      </w:r>
+      <w:r>
+        <w:rPr>
+          <w:b/>
+        </w:rPr>
+        <w:t>Organisations do not link each other's central models.</w:t>
+      </w:r>
+      <w:r>
+        <w:rPr>
+          <w:b w:val="0"/>
+        </w:rPr>
+        <w:t xml:space="preserve"> Information from another organisation is linked from the Shared copy obtained from the CDE (Section 5), so every party coordinates against the same issued state.</w:t>
+      </w:r>
+    </w:p>
+    <w:p>
+      <w:pPr>
+        <w:spacing w:after="60"/>
+        <w:ind w:left="340"/>
+      </w:pPr>
+      <w:r>
+        <w:rPr>
+          <w:b/>
+        </w:rPr>
+        <w:t xml:space="preserve">• </w:t>
+      </w:r>
+      <w:r>
+        <w:rPr>
+          <w:b/>
+        </w:rPr>
+        <w:t>A central model on a server is opened and linked by its network path</w:t>
+      </w:r>
+      <w:r>
+        <w:rPr>
+          <w:b w:val="0"/>
+        </w:rPr>
+        <w:t>, never by a mapped drive letter, so that central and link paths are identical on every workstation.</w:t>
+      </w:r>
+    </w:p>
+    <w:p>
+      <w:pPr>
+        <w:spacing w:after="60"/>
+        <w:ind w:left="340"/>
+      </w:pPr>
+      <w:r>
+        <w:rPr>
+          <w:b/>
+        </w:rPr>
+        <w:t xml:space="preserve">• </w:t>
+      </w:r>
+      <w:r>
+        <w:rPr>
+          <w:b/>
+        </w:rPr>
+        <w:t>Central models are never placed in a folder synchronised by a file-sync client</w:t>
+      </w:r>
+      <w:r>
+        <w:rPr>
+          <w:b w:val="0"/>
+        </w:rPr>
+        <w:t xml:space="preserve"> such as OneDrive, Dropbox or Google Drive. Synchronisation clients corrupt central models.</w:t>
+      </w:r>
+    </w:p>
+    <w:p>
+      <w:pPr>
+        <w:spacing w:after="60"/>
+        <w:ind w:left="340"/>
+      </w:pPr>
+      <w:r>
+        <w:rPr>
+          <w:b/>
+        </w:rPr>
+        <w:t xml:space="preserve">• </w:t>
+      </w:r>
+      <w:r>
+        <w:rPr>
+          <w:b/>
+        </w:rPr>
+        <w:t>Local copies are held on the workstation</w:t>
+      </w:r>
+      <w:r>
+        <w:rPr>
+          <w:b w:val="0"/>
+        </w:rPr>
+        <w:t>, never on the server, and a new local copy is created at the start of each working day.</w:t>
+      </w:r>
+    </w:p>
+    <w:p>
+      <w:pPr>
+        <w:spacing w:after="60"/>
+        <w:ind w:left="340"/>
+      </w:pPr>
+      <w:r>
+        <w:rPr>
+          <w:b/>
+        </w:rPr>
+        <w:t xml:space="preserve">• </w:t>
+      </w:r>
+      <w:r>
+        <w:rPr>
+          <w:b/>
+        </w:rPr>
+        <w:t>Synchronise with the central model at least every two hours</w:t>
+      </w:r>
+      <w:r>
+        <w:rPr>
+          <w:b w:val="0"/>
+        </w:rPr>
+        <w:t>, before any break and before closing, with a short comment. At the end of each day relinquish all borrowed elements and worksets.</w:t>
+      </w:r>
+    </w:p>
+    <w:p>
+      <w:pPr>
+        <w:spacing w:after="60"/>
+        <w:ind w:left="340"/>
+      </w:pPr>
+      <w:r>
+        <w:rPr>
+          <w:b/>
+        </w:rPr>
+        <w:t xml:space="preserve">• </w:t>
+      </w:r>
+      <w:r>
+        <w:rPr>
+          <w:b/>
+        </w:rPr>
+        <w:t>Work by borrowing elements.</w:t>
+      </w:r>
+      <w:r>
+        <w:rPr>
+          <w:b w:val="0"/>
+        </w:rPr>
+        <w:t xml:space="preserve"> Ownership of a whole workset is taken only for the task that requires it.</w:t>
+      </w:r>
+    </w:p>
+    <w:p>
+      <w:pPr>
+        <w:spacing w:after="60"/>
+        <w:ind w:left="340"/>
+      </w:pPr>
+      <w:r>
+        <w:rPr>
+          <w:b/>
+        </w:rPr>
+        <w:t xml:space="preserve">• </w:t>
+      </w:r>
+      <w:r>
+        <w:rPr>
+          <w:b/>
+        </w:rPr>
+        <w:t>Each model has a named owner</w:t>
+      </w:r>
+      <w:r>
+        <w:rPr>
+          <w:b w:val="0"/>
+        </w:rPr>
+        <w:t xml:space="preserve"> who audits and compacts the central model at least weekly, outside working hours. The hosting organisation backs up the server nightly.</w:t>
+      </w:r>
+    </w:p>
+    <w:p>
+      <w:pPr>
+        <w:spacing w:after="60"/>
+        <w:ind w:left="340"/>
+      </w:pPr>
+      <w:r>
+        <w:rPr>
+          <w:b/>
+        </w:rPr>
+        <w:t xml:space="preserve">• </w:t>
+      </w:r>
+      <w:r>
+        <w:rPr>
+          <w:b/>
+        </w:rPr>
+        <w:t>Levels, grids and shared coordinates have one owner per volume.</w:t>
+      </w:r>
+      <w:r>
+        <w:rPr>
+          <w:b w:val="0"/>
+        </w:rPr>
+        <w:t xml:space="preserve"> Other disciplines copy and monitor them and review every change; they are never redrawn locally.</w:t>
+      </w:r>
+    </w:p>
+    <w:p>
+      <w:pPr>
+        <w:spacing w:after="60"/>
+        <w:ind w:left="340"/>
+      </w:pPr>
+      <w:r>
+        <w:rPr>
+          <w:b/>
+        </w:rPr>
+        <w:t xml:space="preserve">• </w:t>
+      </w:r>
+      <w:r>
+        <w:rPr>
+          <w:b/>
+        </w:rPr>
+        <w:t>Links</w:t>
+      </w:r>
+      <w:r>
+        <w:rPr>
+          <w:b w:val="0"/>
+        </w:rPr>
+        <w:t xml:space="preserve"> are positioned by shared coordinates, pinned, set to overlay, placed on a workset of their own and never bound into the host model. A building model is linked once, directly, into the site model; links are not nested.</w:t>
+      </w:r>
     </w:p>
     <w:p>
       <w:r>

</xml_diff>